<commit_message>
Datenschutz auf Build 12 pre Löschen Optimieren aktualisiert
</commit_message>
<xml_diff>
--- a/docs/Datenschutzerklaerung_LoopLeaf_Vercel_iOS_und_Android_19Mai26.docx
+++ b/docs/Datenschutzerklaerung_LoopLeaf_Vercel_iOS_und_Android_19Mai26.docx
@@ -394,34 +394,34 @@
       <w:pPr>
         <w:spacing w:after="120" w:line="259" w:lineRule="auto"/>
         <w:rPr>
-          <w:lang w:val="de-DE"/>
+          <w:lang w:val="it-IT"/>
         </w:rPr>
       </w:pPr>
       <w:proofErr w:type="spellStart"/>
       <w:r>
         <w:rPr>
-          <w:lang w:val="de-DE"/>
+          <w:lang w:val="it-IT"/>
         </w:rPr>
         <w:t>Vercel</w:t>
       </w:r>
       <w:proofErr w:type="spellEnd"/>
       <w:r>
         <w:rPr>
-          <w:lang w:val="de-DE"/>
+          <w:lang w:val="it-IT"/>
         </w:rPr>
         <w:t xml:space="preserve"> Inc., 440 N Barranca Ave #4133, </w:t>
       </w:r>
       <w:proofErr w:type="spellStart"/>
       <w:r>
         <w:rPr>
-          <w:lang w:val="de-DE"/>
+          <w:lang w:val="it-IT"/>
         </w:rPr>
         <w:t>Covina</w:t>
       </w:r>
       <w:proofErr w:type="spellEnd"/>
       <w:r>
         <w:rPr>
-          <w:lang w:val="de-DE"/>
+          <w:lang w:val="it-IT"/>
         </w:rPr>
         <w:t>, CA 91723, USA.</w:t>
       </w:r>
@@ -2897,36 +2897,33 @@
         <w:rPr>
           <w:lang w:val="de-DE"/>
         </w:rPr>
-        <w:t>Die App enthält eine Funktion „Alle Daten löschen“. Mit dieser Funktion können lokal gespeicherte Inhaltsdaten auf dem Gerät gelöscht werden. Dazu gehören insbesondere Kontakte, Check-ins, Tagesenergie-Einträge, eigene Textideen und Notizen.</w:t>
-      </w:r>
-    </w:p>
-    <w:p>
-      <w:pPr>
-        <w:rPr>
-          <w:lang w:val="de-DE"/>
-        </w:rPr>
-      </w:pPr>
-      <w:r>
-        <w:rPr>
-          <w:lang w:val="de-DE"/>
-        </w:rPr>
-        <w:t xml:space="preserve">Je nach Betriebssystem und App-Version können bestimmte technische Einstellungen oder Anzeigeeinstellungen erhalten bleiben, zum Beispiel Erinnerungszeiten, Benachrichtigungseinstellungen, Ansichtsgröße oder Onboarding-Status. Diese Einstellungen enthalten nach aktuellem Stand keine von </w:t>
-      </w:r>
-      <w:proofErr w:type="spellStart"/>
-      <w:proofErr w:type="gramStart"/>
-      <w:r>
-        <w:rPr>
-          <w:lang w:val="de-DE"/>
-        </w:rPr>
-        <w:t>Nutzer:innen</w:t>
-      </w:r>
-      <w:proofErr w:type="spellEnd"/>
-      <w:proofErr w:type="gramEnd"/>
-      <w:r>
-        <w:rPr>
-          <w:lang w:val="de-DE"/>
-        </w:rPr>
-        <w:t xml:space="preserve"> eingegebenen Kontaktinhalte oder Notizen.</w:t>
+        <w:t>Die App enthält eine Funktion „Alle Daten löschen“. Mit dieser Funktion können lokal gespeicherte App-Daten auf dem Gerät gelöscht bzw. auf den Ausgangszustand zurückgesetzt werden. Dazu gehören insbesondere Kontakte, Check-ins, Tagesenergie-Einträge, eigene Textideen, Favoriten, Notizen sowie lokal gespeicherte App-Einstellungen.</w:t>
+      </w:r>
+    </w:p>
+    <w:p>
+      <w:pPr>
+        <w:rPr>
+          <w:lang w:val="de-DE"/>
+        </w:rPr>
+      </w:pPr>
+      <w:r>
+        <w:rPr>
+          <w:lang w:val="de-DE"/>
+        </w:rPr>
+        <w:t>Nach dem Löschen werden bestimmte mitgelieferte Standardinhalte der App, etwa vorinstallierte Textideen, wiederhergestellt. Außerdem werden App-Einstellungen auf ihre Standardwerte zurückgesetzt. Das Onboarding kann anschließend erneut angezeigt werden.</w:t>
+      </w:r>
+    </w:p>
+    <w:p>
+      <w:pPr>
+        <w:rPr>
+          <w:lang w:val="de-DE"/>
+        </w:rPr>
+      </w:pPr>
+      <w:r>
+        <w:rPr>
+          <w:lang w:val="de-DE"/>
+        </w:rPr>
+        <w:t>Bestehende lokale Erinnerungen werden im Rahmen des Löschvorgangs entfernt bzw. mit den Standard-Einstellungen neu synchronisiert. Da nach dem Löschen keine Kontakte mehr vorhanden sind, enthalten Erinnerungen keine kontaktbezogenen Inhalte.</w:t>
       </w:r>
     </w:p>
     <w:p>
@@ -2953,6 +2950,12 @@
           <w:lang w:val="de-DE"/>
         </w:rPr>
         <w:t>Durch eine Deinstallation der App können die lokal gespeicherten App-Daten ebenfalls vom Gerät entfernt werden. Etwaige betriebssystem- oder herstellerseitige Sicherungen und Geräteübertragungen richten sich nach den Einstellungen des jeweiligen Geräts bzw. Nutzerkontos.</w:t>
+      </w:r>
+      <w:r>
+        <w:rPr>
+          <w:lang w:val="de-DE"/>
+        </w:rPr>
+        <w:t xml:space="preserve"> </w:t>
       </w:r>
     </w:p>
     <w:p>
@@ -3001,6 +3004,7 @@
         <w:rPr>
           <w:lang w:val="de-DE"/>
         </w:rPr>
+        <w:lastRenderedPageBreak/>
         <w:t xml:space="preserve">Die App verwendet derzeit keine eigene Serververbindung, keine externen Datenbanken, keine Cloud-Dienste, keine Push-Server, keine </w:t>
       </w:r>
       <w:proofErr w:type="spellStart"/>

</xml_diff>